<commit_message>
Completa secciones 1 a 6 del informe para la veterinaria Mr. Pet
</commit_message>
<xml_diff>
--- a/informe/INFORME_PROYECTO_FINAL.docx
+++ b/informe/INFORME_PROYECTO_FINAL.docx
@@ -326,6 +326,8 @@
           <w:rFonts w:ascii="Arial" w:eastAsia="Arial" w:hAnsi="Arial" w:cs="Arial"/>
           <w:b/>
           <w:bCs/>
+          <w:i w:val="0"/>
+          <w:color w:val="000000"/>
           <w:lang w:val="es-PE"/>
         </w:rPr>
         <w:t>TÍTULO</w:t>
@@ -335,6 +337,8 @@
           <w:rFonts w:ascii="Arial" w:eastAsia="Arial" w:hAnsi="Arial" w:cs="Arial"/>
           <w:b/>
           <w:bCs/>
+          <w:i w:val="0"/>
+          <w:color w:val="000000"/>
           <w:lang w:val="es-PE"/>
         </w:rPr>
         <w:t>:</w:t>
@@ -342,6 +346,8 @@
       <w:r>
         <w:rPr>
           <w:rFonts w:ascii="Arial" w:eastAsia="Arial" w:hAnsi="Arial" w:cs="Arial"/>
+          <w:i w:val="0"/>
+          <w:color w:val="000000"/>
           <w:lang w:val="es-PE"/>
         </w:rPr>
         <w:t xml:space="preserve"> </w:t>
@@ -349,10 +355,11 @@
       <w:r>
         <w:rPr>
           <w:rFonts w:ascii="Arial" w:eastAsia="Arial" w:hAnsi="Arial" w:cs="Arial"/>
-          <w:color w:val="BFBFBF" w:themeColor="background1" w:themeShade="BF"/>
+          <w:i w:val="0"/>
+          <w:color w:val="000000"/>
           <w:lang w:val="es-PE"/>
         </w:rPr>
-        <w:t>Desarrollo de Software para la Gestión de Ventas en la Empresa XYZ S.A., en Lince - Lima</w:t>
+        <w:t>Desarrollo de Software para el Registro de Mascotas y Atenciones en la Veterinaria Mr. Pet</w:t>
       </w:r>
     </w:p>
     <w:p>
@@ -369,6 +376,8 @@
           <w:rFonts w:ascii="Arial" w:eastAsia="Arial" w:hAnsi="Arial" w:cs="Arial"/>
           <w:b/>
           <w:bCs/>
+          <w:i w:val="0"/>
+          <w:color w:val="000000"/>
           <w:lang w:val="es-PE"/>
         </w:rPr>
         <w:t>CURSO:</w:t>
@@ -376,6 +385,8 @@
       <w:r>
         <w:rPr>
           <w:rFonts w:ascii="Arial" w:eastAsia="Arial" w:hAnsi="Arial" w:cs="Arial"/>
+          <w:i w:val="0"/>
+          <w:color w:val="000000"/>
           <w:lang w:val="es-PE"/>
         </w:rPr>
         <w:t xml:space="preserve"> </w:t>
@@ -383,7 +394,8 @@
       <w:r>
         <w:rPr>
           <w:rFonts w:ascii="Arial" w:eastAsia="Arial" w:hAnsi="Arial" w:cs="Arial"/>
-          <w:color w:val="BFBFBF" w:themeColor="background1" w:themeShade="BF"/>
+          <w:i w:val="0"/>
+          <w:color w:val="000000"/>
           <w:lang w:val="es-PE"/>
         </w:rPr>
         <w:t>TÉCNICAS DE PROGRAMACIÓN ORIENTADA A OBJETOS</w:t>
@@ -3749,6 +3761,9 @@
                 <w:lang w:eastAsia="es-VE"/>
               </w:rPr>
             </w:pPr>
+            <w:r>
+              <w:t>23/10/26</w:t>
+            </w:r>
           </w:p>
         </w:tc>
         <w:tc>
@@ -3766,6 +3781,9 @@
                 <w:lang w:eastAsia="es-VE"/>
               </w:rPr>
             </w:pPr>
+            <w:r>
+              <w:t>1.0</w:t>
+            </w:r>
           </w:p>
         </w:tc>
         <w:tc>
@@ -3783,6 +3801,7 @@
                 <w:lang w:eastAsia="es-VE"/>
               </w:rPr>
             </w:pPr>
+            <w:r/>
           </w:p>
         </w:tc>
         <w:tc>
@@ -3800,6 +3819,9 @@
                 <w:lang w:eastAsia="es-VE"/>
               </w:rPr>
             </w:pPr>
+            <w:r>
+              <w:t>POO - UPN</w:t>
+            </w:r>
           </w:p>
         </w:tc>
         <w:tc>
@@ -3817,6 +3839,9 @@
                 <w:lang w:eastAsia="es-VE"/>
               </w:rPr>
             </w:pPr>
+            <w:r>
+              <w:t>Versión inicial: secciones 1 a 6 del informe</w:t>
+            </w:r>
           </w:p>
         </w:tc>
       </w:tr>
@@ -3836,6 +3861,7 @@
                 <w:lang w:eastAsia="es-VE"/>
               </w:rPr>
             </w:pPr>
+            <w:r/>
           </w:p>
         </w:tc>
         <w:tc>
@@ -3853,6 +3879,7 @@
                 <w:lang w:eastAsia="es-VE"/>
               </w:rPr>
             </w:pPr>
+            <w:r/>
           </w:p>
         </w:tc>
         <w:tc>
@@ -3870,6 +3897,7 @@
                 <w:lang w:eastAsia="es-VE"/>
               </w:rPr>
             </w:pPr>
+            <w:r/>
           </w:p>
         </w:tc>
         <w:tc>
@@ -3887,6 +3915,7 @@
                 <w:lang w:eastAsia="es-VE"/>
               </w:rPr>
             </w:pPr>
+            <w:r/>
           </w:p>
         </w:tc>
         <w:tc>
@@ -3904,6 +3933,7 @@
                 <w:lang w:eastAsia="es-VE"/>
               </w:rPr>
             </w:pPr>
+            <w:r/>
           </w:p>
         </w:tc>
       </w:tr>
@@ -3923,6 +3953,7 @@
                 <w:lang w:eastAsia="es-VE"/>
               </w:rPr>
             </w:pPr>
+            <w:r/>
           </w:p>
         </w:tc>
         <w:tc>
@@ -3940,6 +3971,7 @@
                 <w:lang w:eastAsia="es-VE"/>
               </w:rPr>
             </w:pPr>
+            <w:r/>
           </w:p>
         </w:tc>
         <w:tc>
@@ -3957,6 +3989,7 @@
                 <w:lang w:eastAsia="es-VE"/>
               </w:rPr>
             </w:pPr>
+            <w:r/>
           </w:p>
         </w:tc>
         <w:tc>
@@ -3974,6 +4007,7 @@
                 <w:lang w:eastAsia="es-VE"/>
               </w:rPr>
             </w:pPr>
+            <w:r/>
           </w:p>
         </w:tc>
         <w:tc>
@@ -3991,6 +4025,7 @@
                 <w:lang w:eastAsia="es-VE"/>
               </w:rPr>
             </w:pPr>
+            <w:r/>
           </w:p>
         </w:tc>
       </w:tr>
@@ -4010,17 +4045,7 @@
                 <w:lang w:eastAsia="es-VE"/>
               </w:rPr>
             </w:pPr>
-            <w:r>
-              <w:rPr>
-                <w:rFonts w:ascii="Calibri" w:hAnsi="Calibri" w:cs="Arial"/>
-                <w:b/>
-                <w:color w:val="000000"/>
-                <w:sz w:val="22"/>
-                <w:lang w:eastAsia="es-VE"/>
-              </w:rPr>
-              <w:lastRenderedPageBreak/>
-              <w:t>3/05/2023</w:t>
-            </w:r>
+            <w:r/>
           </w:p>
         </w:tc>
         <w:tc>
@@ -4038,16 +4063,7 @@
                 <w:lang w:eastAsia="es-VE"/>
               </w:rPr>
             </w:pPr>
-            <w:r>
-              <w:rPr>
-                <w:rFonts w:ascii="Calibri" w:hAnsi="Calibri" w:cs="Arial"/>
-                <w:b/>
-                <w:color w:val="000000"/>
-                <w:sz w:val="22"/>
-                <w:lang w:eastAsia="es-VE"/>
-              </w:rPr>
-              <w:t>6</w:t>
-            </w:r>
+            <w:r/>
           </w:p>
         </w:tc>
         <w:tc>
@@ -4065,6 +4081,7 @@
                 <w:lang w:eastAsia="es-VE"/>
               </w:rPr>
             </w:pPr>
+            <w:r/>
           </w:p>
         </w:tc>
         <w:tc>
@@ -4082,16 +4099,7 @@
                 <w:lang w:eastAsia="es-VE"/>
               </w:rPr>
             </w:pPr>
-            <w:r>
-              <w:rPr>
-                <w:rFonts w:ascii="Calibri" w:hAnsi="Calibri" w:cs="Arial"/>
-                <w:b/>
-                <w:color w:val="000000"/>
-                <w:sz w:val="22"/>
-                <w:lang w:eastAsia="es-VE"/>
-              </w:rPr>
-              <w:t>POO - UPN</w:t>
-            </w:r>
+            <w:r/>
           </w:p>
         </w:tc>
         <w:tc>
@@ -4109,7 +4117,11 @@
                 <w:lang w:eastAsia="es-VE"/>
               </w:rPr>
             </w:pPr>
-            <w:r>
+            <w:r/>
+          </w:p>
+          <w:p>
+            <w:pPr>
+              <w:jc w:val="center"/>
               <w:rPr>
                 <w:rFonts w:ascii="Calibri" w:hAnsi="Calibri" w:cs="Arial"/>
                 <w:b/>
@@ -4117,20 +4129,8 @@
                 <w:sz w:val="22"/>
                 <w:lang w:eastAsia="es-VE"/>
               </w:rPr>
-              <w:t>4.1. Agregamos colecciones</w:t>
-            </w:r>
-          </w:p>
-          <w:p>
-            <w:pPr>
-              <w:jc w:val="center"/>
-              <w:rPr>
-                <w:rFonts w:ascii="Calibri" w:hAnsi="Calibri" w:cs="Arial"/>
-                <w:b/>
-                <w:color w:val="000000"/>
-                <w:sz w:val="22"/>
-                <w:lang w:eastAsia="es-VE"/>
-              </w:rPr>
             </w:pPr>
+            <w:r/>
           </w:p>
         </w:tc>
       </w:tr>
@@ -4150,16 +4150,7 @@
                 <w:lang w:eastAsia="es-VE"/>
               </w:rPr>
             </w:pPr>
-            <w:r>
-              <w:rPr>
-                <w:rFonts w:ascii="Calibri" w:hAnsi="Calibri" w:cs="Arial"/>
-                <w:b/>
-                <w:color w:val="000000"/>
-                <w:sz w:val="22"/>
-                <w:lang w:eastAsia="es-VE"/>
-              </w:rPr>
-              <w:t>10/05/2023</w:t>
-            </w:r>
+            <w:r/>
           </w:p>
         </w:tc>
         <w:tc>
@@ -4177,16 +4168,7 @@
                 <w:lang w:eastAsia="es-VE"/>
               </w:rPr>
             </w:pPr>
-            <w:r>
-              <w:rPr>
-                <w:rFonts w:ascii="Calibri" w:hAnsi="Calibri" w:cs="Arial"/>
-                <w:b/>
-                <w:color w:val="000000"/>
-                <w:sz w:val="22"/>
-                <w:lang w:eastAsia="es-VE"/>
-              </w:rPr>
-              <w:t>7</w:t>
-            </w:r>
+            <w:r/>
           </w:p>
         </w:tc>
         <w:tc>
@@ -4204,6 +4186,7 @@
                 <w:lang w:eastAsia="es-VE"/>
               </w:rPr>
             </w:pPr>
+            <w:r/>
           </w:p>
         </w:tc>
         <w:tc>
@@ -4221,6 +4204,7 @@
                 <w:lang w:eastAsia="es-VE"/>
               </w:rPr>
             </w:pPr>
+            <w:r/>
           </w:p>
         </w:tc>
         <w:tc>
@@ -4238,18 +4222,7 @@
                 <w:lang w:eastAsia="es-VE"/>
               </w:rPr>
             </w:pPr>
-            <w:proofErr w:type="spellStart"/>
-            <w:r>
-              <w:rPr>
-                <w:rFonts w:ascii="Calibri" w:hAnsi="Calibri" w:cs="Arial"/>
-                <w:b/>
-                <w:color w:val="000000"/>
-                <w:sz w:val="22"/>
-                <w:lang w:eastAsia="es-VE"/>
-              </w:rPr>
-              <w:t>xyz</w:t>
-            </w:r>
-            <w:proofErr w:type="spellEnd"/>
+            <w:r/>
           </w:p>
         </w:tc>
       </w:tr>
@@ -4344,6 +4317,9 @@
                 <w:lang w:eastAsia="es-VE"/>
               </w:rPr>
             </w:pPr>
+            <w:r>
+              <w:t>Veterinaria Mr. Pet</w:t>
+            </w:r>
           </w:p>
         </w:tc>
       </w:tr>
@@ -4389,6 +4365,9 @@
                 <w:lang w:eastAsia="es-VE"/>
               </w:rPr>
             </w:pPr>
+            <w:r>
+              <w:t>Desarrollo de software para el registro de mascotas y atenciones en la veterinaria Mr. Pet</w:t>
+            </w:r>
           </w:p>
         </w:tc>
       </w:tr>
@@ -4434,6 +4413,9 @@
                 <w:lang w:eastAsia="es-VE"/>
               </w:rPr>
             </w:pPr>
+            <w:r>
+              <w:t>23/10/2026</w:t>
+            </w:r>
           </w:p>
         </w:tc>
       </w:tr>
@@ -4479,6 +4461,9 @@
                 <w:lang w:eastAsia="es-VE"/>
               </w:rPr>
             </w:pPr>
+            <w:r>
+              <w:t>Veterinaria Mr. Pet</w:t>
+            </w:r>
           </w:p>
         </w:tc>
       </w:tr>
@@ -4524,6 +4509,9 @@
                 <w:lang w:eastAsia="es-VE"/>
               </w:rPr>
             </w:pPr>
+            <w:r>
+              <w:t>Propietario(a) de la veterinaria Mr. Pet (por confirmar)</w:t>
+            </w:r>
           </w:p>
         </w:tc>
       </w:tr>
@@ -4569,6 +4557,9 @@
                 <w:lang w:eastAsia="es-VE"/>
               </w:rPr>
             </w:pPr>
+            <w:r>
+              <w:t>Por completar</w:t>
+            </w:r>
           </w:p>
         </w:tc>
       </w:tr>
@@ -4614,6 +4605,9 @@
                 <w:lang w:eastAsia="es-VE"/>
               </w:rPr>
             </w:pPr>
+            <w:r>
+              <w:t>Por completar</w:t>
+            </w:r>
           </w:p>
         </w:tc>
       </w:tr>
@@ -5374,12 +5368,136 @@
       <w:r>
         <w:rPr>
           <w:rFonts w:ascii="Arial" w:hAnsi="Arial" w:cs="Arial"/>
+          <w:i w:val="0"/>
+          <w:color w:val="000000"/>
+          <w:sz w:val="22"/>
+          <w:szCs w:val="22"/>
+        </w:rPr>
+        <w:t>La veterinaria Mr. Pet atiende a mascotas de distintos dueños. Cada atención genera información que debe conservarse: datos del dueño y de la mascota, vacunas, desparasitaciones, diagnósticos, tratamientos y citas. Se plantea que este registro se realiza de forma manual, mediante fichas en papel y cuadernos, lo que provoca información dispersa, datos duplicados, fichas deterioradas o extraviadas y citas que se cruzan.</w:t>
+      </w:r>
+    </w:p>
+    <w:p>
+      <w:pPr>
+        <w:spacing w:before="240" w:after="240" w:line="360" w:lineRule="auto"/>
+        <w:jc w:val="both"/>
+        <w:rPr>
+          <w:rFonts w:ascii="Arial" w:hAnsi="Arial" w:cs="Arial"/>
           <w:i/>
           <w:color w:val="BFBFBF" w:themeColor="background1" w:themeShade="BF"/>
           <w:sz w:val="22"/>
           <w:szCs w:val="22"/>
         </w:rPr>
-        <w:t>Se recomienda describir mediante texto, pero además elaborar Diagrama de Ishikawa (obligatorio).</w:t>
+      </w:pPr>
+      <w:r>
+        <w:rPr>
+          <w:rFonts w:ascii="Arial" w:hAnsi="Arial" w:cs="Arial"/>
+          <w:i w:val="0"/>
+          <w:color w:val="000000"/>
+          <w:sz w:val="22"/>
+          <w:szCs w:val="22"/>
+        </w:rPr>
+        <w:t>Para ordenar las causas se elaboró un Diagrama de Ishikawa, que agrupa los factores en seis categorías: métodos, personas, materiales, tecnología, medición y entorno (Figura 1).</w:t>
+      </w:r>
+    </w:p>
+    <w:p>
+      <w:pPr>
+        <w:spacing w:before="240" w:after="240" w:line="360" w:lineRule="auto"/>
+        <w:jc w:val="center"/>
+        <w:rPr>
+          <w:rFonts w:ascii="Arial" w:hAnsi="Arial" w:cs="Arial"/>
+          <w:i/>
+          <w:color w:val="BFBFBF" w:themeColor="background1" w:themeShade="BF"/>
+          <w:sz w:val="22"/>
+          <w:szCs w:val="22"/>
+        </w:rPr>
+      </w:pPr>
+      <w:r>
+        <w:rPr>
+          <w:rFonts w:ascii="Arial" w:hAnsi="Arial" w:cs="Arial"/>
+          <w:i w:val="0"/>
+          <w:color w:val="000000"/>
+          <w:sz w:val="22"/>
+          <w:szCs w:val="22"/>
+        </w:rPr>
+        <w:t>Figura 1. Diagrama de Ishikawa del problema en la veterinaria Mr. Pet</w:t>
+      </w:r>
+    </w:p>
+    <w:p>
+      <w:pPr>
+        <w:spacing w:before="240" w:after="240" w:line="360" w:lineRule="auto"/>
+        <w:jc w:val="center"/>
+        <w:rPr>
+          <w:rFonts w:ascii="Arial" w:hAnsi="Arial" w:cs="Arial"/>
+          <w:i/>
+          <w:color w:val="BFBFBF" w:themeColor="background1" w:themeShade="BF"/>
+          <w:sz w:val="22"/>
+          <w:szCs w:val="22"/>
+        </w:rPr>
+      </w:pPr>
+      <w:r>
+        <w:rPr>
+          <w:rFonts w:ascii="Arial" w:hAnsi="Arial" w:cs="Arial"/>
+          <w:i w:val="0"/>
+          <w:noProof/>
+          <w:color w:val="000000"/>
+          <w:sz w:val="22"/>
+          <w:szCs w:val="22"/>
+        </w:rPr>
+        <w:drawing>
+          <wp:inline xmlns:a="http://schemas.openxmlformats.org/drawingml/2006/main" xmlns:pic="http://schemas.openxmlformats.org/drawingml/2006/picture">
+            <wp:extent cx="5394960" cy="2502187"/>
+            <wp:docPr id="1473879419" name="Picture 1473879419"/>
+            <wp:cNvGraphicFramePr>
+              <a:graphicFrameLocks noChangeAspect="1"/>
+            </wp:cNvGraphicFramePr>
+            <a:graphic>
+              <a:graphicData uri="http://schemas.openxmlformats.org/drawingml/2006/picture">
+                <pic:pic>
+                  <pic:nvPicPr>
+                    <pic:cNvPr id="0" name="ishikawa.png"/>
+                    <pic:cNvPicPr/>
+                  </pic:nvPicPr>
+                  <pic:blipFill>
+                    <a:blip r:embed="rId16"/>
+                    <a:stretch>
+                      <a:fillRect/>
+                    </a:stretch>
+                  </pic:blipFill>
+                  <pic:spPr>
+                    <a:xfrm>
+                      <a:off x="0" y="0"/>
+                      <a:ext cx="5394960" cy="2502187"/>
+                    </a:xfrm>
+                    <a:prstGeom prst="rect"/>
+                  </pic:spPr>
+                </pic:pic>
+              </a:graphicData>
+            </a:graphic>
+          </wp:inline>
+        </w:drawing>
+      </w:r>
+    </w:p>
+    <w:p>
+      <w:pPr>
+        <w:spacing w:before="240" w:after="240" w:line="360" w:lineRule="auto"/>
+        <w:jc w:val="center"/>
+        <w:rPr>
+          <w:rFonts w:ascii="Arial" w:hAnsi="Arial" w:cs="Arial"/>
+          <w:i/>
+          <w:color w:val="BFBFBF" w:themeColor="background1" w:themeShade="BF"/>
+          <w:sz w:val="22"/>
+          <w:szCs w:val="22"/>
+        </w:rPr>
+      </w:pPr>
+      <w:r>
+        <w:rPr>
+          <w:rFonts w:ascii="Arial" w:hAnsi="Arial" w:cs="Arial"/>
+          <w:i w:val="0"/>
+          <w:color w:val="000000"/>
+          <w:sz w:val="22"/>
+          <w:szCs w:val="22"/>
+        </w:rPr>
+        <w:t>Fuente: elaboración propia</w:t>
       </w:r>
     </w:p>
     <w:p>
@@ -5397,12 +5515,12 @@
       <w:r>
         <w:rPr>
           <w:rFonts w:ascii="Arial" w:hAnsi="Arial" w:cs="Arial"/>
-          <w:i/>
-          <w:color w:val="BFBFBF" w:themeColor="background1" w:themeShade="BF"/>
-          <w:sz w:val="22"/>
-          <w:szCs w:val="22"/>
-        </w:rPr>
-        <w:t>Concluir relatando el problema que abordaremos en el trabajo.</w:t>
+          <w:i w:val="0"/>
+          <w:color w:val="000000"/>
+          <w:sz w:val="22"/>
+          <w:szCs w:val="22"/>
+        </w:rPr>
+        <w:t>En conclusión, el problema que abordará este trabajo es la falta de un sistema que registre de forma centralizada y ordenada a los dueños, las mascotas, sus fichas clínicas y las citas de la veterinaria Mr. Pet. Esta falta ocasiona pérdida de historiales, citas duplicadas y demora en la atención.</w:t>
       </w:r>
     </w:p>
     <w:p>
@@ -5467,12 +5585,58 @@
       <w:r>
         <w:rPr>
           <w:rFonts w:ascii="Arial" w:hAnsi="Arial" w:cs="Arial"/>
+          <w:i w:val="0"/>
+          <w:color w:val="000000"/>
+          <w:sz w:val="22"/>
+          <w:szCs w:val="22"/>
+        </w:rPr>
+        <w:t>Se revisaron trabajos que desarrollaron sistemas de gestión para clínicas veterinarias. Ambos abordan el reemplazo del registro en papel por un sistema informático.</w:t>
+      </w:r>
+    </w:p>
+    <w:p>
+      <w:pPr>
+        <w:spacing w:before="240" w:after="240" w:line="360" w:lineRule="auto"/>
+        <w:jc w:val="left"/>
+        <w:rPr>
+          <w:rFonts w:ascii="Arial" w:hAnsi="Arial" w:cs="Arial"/>
           <w:i/>
           <w:color w:val="BFBFBF" w:themeColor="background1" w:themeShade="BF"/>
           <w:sz w:val="22"/>
           <w:szCs w:val="22"/>
         </w:rPr>
-        <w:t>Primero se debe mencionar y citar (bajo formato APA v6) los antecedentes que existen del software propuesto.</w:t>
+      </w:pPr>
+      <w:r>
+        <w:rPr>
+          <w:rFonts w:ascii="Arial" w:hAnsi="Arial" w:cs="Arial"/>
+          <w:i w:val="0"/>
+          <w:color w:val="000000"/>
+          <w:sz w:val="22"/>
+          <w:szCs w:val="22"/>
+        </w:rPr>
+        <w:t>Jaffar, N. B., &amp; Mohd Zin, N. A. (2021). The development of veterinary clinic management system using structured approach. Applied Information Technology and Computer Science, 2(2), 1555–1567. https://penerbit.uthm.edu.my/periodicals/index.php/aitcs/article/view/2339</w:t>
+      </w:r>
+    </w:p>
+    <w:p>
+      <w:pPr>
+        <w:spacing w:before="240" w:after="240" w:line="360" w:lineRule="auto"/>
+        <w:jc w:val="left"/>
+        <w:rPr>
+          <w:rFonts w:ascii="Arial" w:hAnsi="Arial" w:cs="Arial"/>
+          <w:i/>
+          <w:color w:val="BFBFBF" w:themeColor="background1" w:themeShade="BF"/>
+          <w:sz w:val="22"/>
+          <w:szCs w:val="22"/>
+        </w:rPr>
+      </w:pPr>
+      <w:r>
+        <w:rPr>
+          <w:rFonts w:ascii="Arial" w:hAnsi="Arial" w:cs="Arial"/>
+          <w:i w:val="0"/>
+          <w:color w:val="000000"/>
+          <w:sz w:val="22"/>
+          <w:szCs w:val="22"/>
+        </w:rPr>
+        <w:t>Hernández Pérez, H. (s. f.). Sistema de información para el control de expedientes clínicos para médicos veterinarios. Universidad Central «Marta Abreu» de Las Villas. https://dspace.uclv.edu.cu/handle/123456789/1502</w:t>
       </w:r>
     </w:p>
     <w:p>
@@ -5490,35 +5654,12 @@
       <w:r>
         <w:rPr>
           <w:rFonts w:ascii="Arial" w:hAnsi="Arial" w:cs="Arial"/>
-          <w:i/>
-          <w:color w:val="BFBFBF" w:themeColor="background1" w:themeShade="BF"/>
-          <w:sz w:val="22"/>
-          <w:szCs w:val="22"/>
-        </w:rPr>
-        <w:t>Además, aquí se pueden incluir otros documentos impresos, documentos o direcciones electrónicos que complementen la documentación de requerimientos de software, por ejemplo: Documentos de visión, definición de alcance, otros documentos de especificación de requerimientos de software, flujogramas, políticas, procedimientos de la organización, entre otros.</w:t>
-      </w:r>
-    </w:p>
-    <w:p>
-      <w:pPr>
-        <w:spacing w:before="240" w:after="240" w:line="360" w:lineRule="auto"/>
-        <w:jc w:val="both"/>
-        <w:rPr>
-          <w:rFonts w:ascii="Arial" w:hAnsi="Arial" w:cs="Arial"/>
-          <w:i/>
-          <w:color w:val="BFBFBF" w:themeColor="background1" w:themeShade="BF"/>
-          <w:sz w:val="22"/>
-          <w:szCs w:val="22"/>
-        </w:rPr>
-      </w:pPr>
-      <w:r>
-        <w:rPr>
-          <w:rFonts w:ascii="Arial" w:hAnsi="Arial" w:cs="Arial"/>
-          <w:i/>
-          <w:color w:val="BFBFBF" w:themeColor="background1" w:themeShade="BF"/>
-          <w:sz w:val="22"/>
-          <w:szCs w:val="22"/>
-        </w:rPr>
-        <w:t>Para cada referencia es recomendable incluir el título, autor, versión, fecha y ubicación física o electrónica.</w:t>
+          <w:i w:val="0"/>
+          <w:color w:val="000000"/>
+          <w:sz w:val="22"/>
+          <w:szCs w:val="22"/>
+        </w:rPr>
+        <w:t>El primer trabajo construyó un sistema web para una clínica animal con PHP y MySQL, que incluye reserva de citas y recordatorios para reducir el papeleo. El segundo presenta un sistema para controlar expedientes clínicos veterinarios y sustituir las fichas en papel. Ambos respaldan la propuesta para Mr. Pet.</w:t>
       </w:r>
     </w:p>
     <w:p>
@@ -5645,6 +5786,29 @@
     </w:p>
     <w:p>
       <w:pPr>
+        <w:spacing w:before="240" w:after="240" w:line="360" w:lineRule="auto"/>
+        <w:jc w:val="both"/>
+        <w:rPr>
+          <w:rFonts w:ascii="Arial" w:hAnsi="Arial" w:cs="Arial"/>
+          <w:i/>
+          <w:color w:val="BFBFBF" w:themeColor="background1" w:themeShade="BF"/>
+          <w:sz w:val="22"/>
+          <w:szCs w:val="22"/>
+        </w:rPr>
+      </w:pPr>
+      <w:r>
+        <w:rPr>
+          <w:rFonts w:ascii="Arial" w:hAnsi="Arial" w:cs="Arial"/>
+          <w:i w:val="0"/>
+          <w:color w:val="000000"/>
+          <w:sz w:val="22"/>
+          <w:szCs w:val="22"/>
+        </w:rPr>
+        <w:t>Restricciones: el proyecto debe terminarse dentro del ciclo 2026-02 con entregas en las semanas 2, 4 y 7; se programa en Java, como exige el curso; no hay presupuesto para licencias, por lo que se usan herramientas gratuitas; y el equipo es de estudiantes, por lo que el alcance se limita al registro y las citas. Suposiciones: Mr. Pet registra hoy su información de forma manual, el personal está dispuesto a usar el sistema y se podrá contar con datos de ejemplo. Estos supuestos se validarán con el cliente.</w:t>
+      </w:r>
+    </w:p>
+    <w:p>
+      <w:pPr>
         <w:pStyle w:val="Prrafodelista"/>
         <w:numPr>
           <w:ilvl w:val="1"/>
@@ -5687,6 +5851,29 @@
     </w:p>
     <w:p>
       <w:pPr>
+        <w:spacing w:before="240" w:after="240" w:line="360" w:lineRule="auto"/>
+        <w:jc w:val="both"/>
+        <w:rPr>
+          <w:rFonts w:ascii="Arial" w:hAnsi="Arial" w:cs="Arial"/>
+          <w:i/>
+          <w:color w:val="BFBFBF" w:themeColor="background1" w:themeShade="BF"/>
+          <w:sz w:val="22"/>
+          <w:szCs w:val="22"/>
+        </w:rPr>
+      </w:pPr>
+      <w:r>
+        <w:rPr>
+          <w:rFonts w:ascii="Arial" w:hAnsi="Arial" w:cs="Arial"/>
+          <w:i w:val="0"/>
+          <w:color w:val="000000"/>
+          <w:sz w:val="22"/>
+          <w:szCs w:val="22"/>
+        </w:rPr>
+        <w:t>Se analizaron tres alternativas. A: aplicación de escritorio en Java que guarda los datos en archivos, simple pero con búsquedas lentas. B: aplicación de escritorio en Java con base de datos, que ordena mejor los datos y permite consultas rápidas. C: aplicación web, que exige alojamiento y más tiempo de desarrollo.</w:t>
+      </w:r>
+    </w:p>
+    <w:p>
+      <w:pPr>
         <w:pStyle w:val="Prrafodelista"/>
         <w:numPr>
           <w:ilvl w:val="1"/>
@@ -5747,6 +5934,29 @@
     </w:p>
     <w:p>
       <w:pPr>
+        <w:spacing w:before="240" w:after="240" w:line="360" w:lineRule="auto"/>
+        <w:jc w:val="both"/>
+        <w:rPr>
+          <w:rFonts w:ascii="Arial" w:hAnsi="Arial" w:cs="Arial"/>
+          <w:i/>
+          <w:color w:val="BFBFBF" w:themeColor="background1" w:themeShade="BF"/>
+          <w:sz w:val="22"/>
+          <w:szCs w:val="22"/>
+        </w:rPr>
+      </w:pPr>
+      <w:r>
+        <w:rPr>
+          <w:rFonts w:ascii="Arial" w:hAnsi="Arial" w:cs="Arial"/>
+          <w:i w:val="0"/>
+          <w:color w:val="000000"/>
+          <w:sz w:val="22"/>
+          <w:szCs w:val="22"/>
+        </w:rPr>
+        <w:t>Los criterios fueron: costo (sin licencias de pago), impacto ambiental (menos papel), impacto social (atención más rápida a los dueños), ética y seguridad (protección de los datos personales según la Ley N.° 29733 y acceso por usuario) y viabilidad técnica dentro del ciclo. Se selecciona la alternativa B, porque cumple los criterios con el menor riesgo para el cronograma.</w:t>
+      </w:r>
+    </w:p>
+    <w:p>
+      <w:pPr>
         <w:spacing w:before="100" w:beforeAutospacing="1" w:after="100" w:afterAutospacing="1" w:line="276" w:lineRule="auto"/>
         <w:ind w:left="567"/>
         <w:outlineLvl w:val="0"/>
@@ -5818,12 +6028,12 @@
       <w:r>
         <w:rPr>
           <w:rFonts w:ascii="Arial" w:hAnsi="Arial" w:cs="Arial"/>
-          <w:i/>
-          <w:color w:val="BFBFBF" w:themeColor="background1" w:themeShade="BF"/>
-          <w:sz w:val="22"/>
-          <w:szCs w:val="22"/>
-        </w:rPr>
-        <w:t>Se incluye una corta descripción del alcance del software que se está especificando, incluyendo:</w:t>
+          <w:i w:val="0"/>
+          <w:color w:val="000000"/>
+          <w:sz w:val="22"/>
+          <w:szCs w:val="22"/>
+        </w:rPr>
+        <w:t>El software permitirá registrar y consultar la información de los dueños, las mascotas, sus fichas clínicas y las citas de la veterinaria Mr. Pet.</w:t>
       </w:r>
     </w:p>
     <w:p>
@@ -5846,13 +6056,12 @@
       <w:r>
         <w:rPr>
           <w:rFonts w:ascii="Arial" w:hAnsi="Arial" w:cs="Arial"/>
-          <w:i/>
-          <w:color w:val="BFBFBF" w:themeColor="background1" w:themeShade="BF"/>
-          <w:sz w:val="22"/>
-          <w:szCs w:val="22"/>
-        </w:rPr>
-        <w:lastRenderedPageBreak/>
-        <w:t>Su propósito u objetivo general.</w:t>
+          <w:i w:val="0"/>
+          <w:color w:val="000000"/>
+          <w:sz w:val="22"/>
+          <w:szCs w:val="22"/>
+        </w:rPr>
+        <w:t>Propósito: reemplazar el registro en papel por un sistema centralizado y ordenado.</w:t>
       </w:r>
     </w:p>
     <w:p>
@@ -5875,12 +6084,12 @@
       <w:r>
         <w:rPr>
           <w:rFonts w:ascii="Arial" w:hAnsi="Arial" w:cs="Arial"/>
-          <w:i/>
-          <w:color w:val="BFBFBF" w:themeColor="background1" w:themeShade="BF"/>
-          <w:sz w:val="22"/>
-          <w:szCs w:val="22"/>
-        </w:rPr>
-        <w:t>Beneficios que brinda al área de negocio y organización.</w:t>
+          <w:i w:val="0"/>
+          <w:color w:val="000000"/>
+          <w:sz w:val="22"/>
+          <w:szCs w:val="22"/>
+        </w:rPr>
+        <w:t>Beneficios: recuperar el historial de cada mascota en segundos, evitar citas duplicadas, hacer seguimiento de vacunas y reducir el uso de papel.</w:t>
       </w:r>
     </w:p>
     <w:p>
@@ -5903,12 +6112,12 @@
       <w:r>
         <w:rPr>
           <w:rFonts w:ascii="Arial" w:hAnsi="Arial" w:cs="Arial"/>
-          <w:i/>
-          <w:color w:val="BFBFBF" w:themeColor="background1" w:themeShade="BF"/>
-          <w:sz w:val="22"/>
-          <w:szCs w:val="22"/>
-        </w:rPr>
-        <w:t>Objetivos y metas. Es recomendable establecer la relación de los objetivos del software con los objetivos corporativos y estrategias de negocio.</w:t>
+          <w:i w:val="0"/>
+          <w:color w:val="000000"/>
+          <w:sz w:val="22"/>
+          <w:szCs w:val="22"/>
+        </w:rPr>
+        <w:t>Incluye: registro de dueños y mascotas, ficha clínica con vacunas y tratamientos, programación de citas con veterinarios, consultas y búsquedas.</w:t>
       </w:r>
     </w:p>
     <w:p>
@@ -5931,12 +6140,12 @@
       <w:r>
         <w:rPr>
           <w:rFonts w:ascii="Arial" w:hAnsi="Arial" w:cs="Arial"/>
-          <w:i/>
-          <w:color w:val="BFBFBF" w:themeColor="background1" w:themeShade="BF"/>
-          <w:sz w:val="22"/>
-          <w:szCs w:val="22"/>
-        </w:rPr>
-        <w:t>Se puede hacer referencia a otros documentos, por ejemplo, una definición de alcance u acta de constitución del proyecto.</w:t>
+          <w:i w:val="0"/>
+          <w:color w:val="000000"/>
+          <w:sz w:val="22"/>
+          <w:szCs w:val="22"/>
+        </w:rPr>
+        <w:t>No incluye: facturación electrónica, venta de productos, pagos en línea ni aplicación móvil.</w:t>
       </w:r>
     </w:p>
     <w:p>
@@ -5992,82 +6201,13 @@
       <w:r>
         <w:rPr>
           <w:rFonts w:ascii="Arial" w:hAnsi="Arial" w:cs="Arial"/>
+          <w:i w:val="0"/>
           <w:iCs/>
-          <w:color w:val="BFBFBF" w:themeColor="background1" w:themeShade="BF"/>
-          <w:sz w:val="22"/>
-          <w:szCs w:val="22"/>
-        </w:rPr>
-        <w:t xml:space="preserve">Desarrollar un software de gestión de </w:t>
-      </w:r>
-      <w:r>
-        <w:rPr>
-          <w:rFonts w:ascii="Arial" w:hAnsi="Arial" w:cs="Arial"/>
-          <w:iCs/>
-          <w:color w:val="BFBFBF" w:themeColor="background1" w:themeShade="BF"/>
-          <w:sz w:val="22"/>
-          <w:szCs w:val="22"/>
-          <w:highlight w:val="yellow"/>
-        </w:rPr>
-        <w:t>envíos de paquetes</w:t>
-      </w:r>
-      <w:r>
-        <w:rPr>
-          <w:rFonts w:ascii="Arial" w:hAnsi="Arial" w:cs="Arial"/>
-          <w:iCs/>
-          <w:color w:val="BFBFBF" w:themeColor="background1" w:themeShade="BF"/>
-          <w:sz w:val="22"/>
-          <w:szCs w:val="22"/>
-        </w:rPr>
-        <w:t xml:space="preserve"> para la empresa SHALOM EMPRESARIAL S.A.C.  </w:t>
-      </w:r>
-    </w:p>
-    <w:p>
-      <w:pPr>
-        <w:pStyle w:val="Prrafodelista"/>
-        <w:numPr>
-          <w:ilvl w:val="0"/>
-          <w:numId w:val="48"/>
-        </w:numPr>
-        <w:spacing w:before="240" w:after="240" w:line="360" w:lineRule="auto"/>
-        <w:jc w:val="both"/>
-        <w:rPr>
-          <w:rFonts w:ascii="Arial" w:hAnsi="Arial" w:cs="Arial"/>
-          <w:iCs/>
-          <w:color w:val="BFBFBF" w:themeColor="background1" w:themeShade="BF"/>
-          <w:sz w:val="22"/>
-          <w:szCs w:val="22"/>
-        </w:rPr>
-      </w:pPr>
-      <w:r>
-        <w:rPr>
-          <w:rFonts w:ascii="Arial" w:hAnsi="Arial" w:cs="Arial"/>
-          <w:iCs/>
-          <w:color w:val="BFBFBF" w:themeColor="background1" w:themeShade="BF"/>
-          <w:sz w:val="22"/>
-          <w:szCs w:val="22"/>
-        </w:rPr>
-        <w:t xml:space="preserve">Desarrollar un software de gestión de </w:t>
-      </w:r>
-      <w:r>
-        <w:rPr>
-          <w:rFonts w:ascii="Arial" w:hAnsi="Arial" w:cs="Arial"/>
-          <w:iCs/>
-          <w:color w:val="BFBFBF" w:themeColor="background1" w:themeShade="BF"/>
-          <w:sz w:val="22"/>
-          <w:szCs w:val="22"/>
-          <w:highlight w:val="yellow"/>
-        </w:rPr>
-        <w:t>envíos de paquetes</w:t>
-      </w:r>
-      <w:r>
-        <w:rPr>
-          <w:rFonts w:ascii="Arial" w:hAnsi="Arial" w:cs="Arial"/>
-          <w:iCs/>
-          <w:color w:val="BFBFBF" w:themeColor="background1" w:themeShade="BF"/>
-          <w:sz w:val="22"/>
-          <w:szCs w:val="22"/>
-        </w:rPr>
-        <w:t xml:space="preserve">, para mejorar la gestión de la información de la empresa SHALOM EMPRESARIAL S.A.C.  </w:t>
+          <w:color w:val="000000"/>
+          <w:sz w:val="22"/>
+          <w:szCs w:val="22"/>
+        </w:rPr>
+        <w:t>Desarrollar un software de registro de mascotas y atenciones para la veterinaria Mr. Pet, que permita mejorar la gestión de su información.</w:t>
       </w:r>
     </w:p>
     <w:p>
@@ -6123,12 +6263,13 @@
       <w:r>
         <w:rPr>
           <w:rFonts w:ascii="Arial" w:hAnsi="Arial" w:cs="Arial"/>
+          <w:i w:val="0"/>
           <w:iCs/>
-          <w:color w:val="BFBFBF" w:themeColor="background1" w:themeShade="BF"/>
-          <w:sz w:val="22"/>
-          <w:szCs w:val="22"/>
-        </w:rPr>
-        <w:t>Recopilar y analizar información referente al proceso de envío de paquetes del área de logística.</w:t>
+          <w:color w:val="000000"/>
+          <w:sz w:val="22"/>
+          <w:szCs w:val="22"/>
+        </w:rPr>
+        <w:t>Recopilar y analizar información sobre el proceso de registro de dueños, mascotas, fichas clínicas y citas de la veterinaria Mr. Pet.</w:t>
       </w:r>
     </w:p>
     <w:p>
@@ -6151,12 +6292,13 @@
       <w:r>
         <w:rPr>
           <w:rFonts w:ascii="Arial" w:hAnsi="Arial" w:cs="Arial"/>
+          <w:i w:val="0"/>
           <w:iCs/>
-          <w:color w:val="BFBFBF" w:themeColor="background1" w:themeShade="BF"/>
-          <w:sz w:val="22"/>
-          <w:szCs w:val="22"/>
-        </w:rPr>
-        <w:t>Elaborar un modelo de datos del proceso de envío de paquetes, haciendo uso del sistema de gestión de base de datos MySQL 8.</w:t>
+          <w:color w:val="000000"/>
+          <w:sz w:val="22"/>
+          <w:szCs w:val="22"/>
+        </w:rPr>
+        <w:t>Elaborar el diagrama de clases y el modelo de datos del registro y la atención de mascotas.</w:t>
       </w:r>
     </w:p>
     <w:p>
@@ -6179,12 +6321,13 @@
       <w:r>
         <w:rPr>
           <w:rFonts w:ascii="Arial" w:hAnsi="Arial" w:cs="Arial"/>
+          <w:i w:val="0"/>
           <w:iCs/>
-          <w:color w:val="BFBFBF" w:themeColor="background1" w:themeShade="BF"/>
-          <w:sz w:val="22"/>
-          <w:szCs w:val="22"/>
-        </w:rPr>
-        <w:t>Realizar las actividades de programación del software de envió de paquetes, haciendo uso del lenguaje de programación Java / JavaScript.</w:t>
+          <w:color w:val="000000"/>
+          <w:sz w:val="22"/>
+          <w:szCs w:val="22"/>
+        </w:rPr>
+        <w:t>Programar el software en Java aplicando los conceptos de programación orientada a objetos.</w:t>
       </w:r>
     </w:p>
     <w:p>
@@ -6207,12 +6350,13 @@
       <w:r>
         <w:rPr>
           <w:rFonts w:ascii="Arial" w:hAnsi="Arial" w:cs="Arial"/>
+          <w:i w:val="0"/>
           <w:iCs/>
-          <w:color w:val="BFBFBF" w:themeColor="background1" w:themeShade="BF"/>
-          <w:sz w:val="22"/>
-          <w:szCs w:val="22"/>
-        </w:rPr>
-        <w:t>Realizar las pruebas de software para asegurar la calidad y funcionalidad del software de envió paquetes.</w:t>
+          <w:color w:val="000000"/>
+          <w:sz w:val="22"/>
+          <w:szCs w:val="22"/>
+        </w:rPr>
+        <w:t>Realizar pruebas para asegurar la calidad y el funcionamiento del software.</w:t>
       </w:r>
     </w:p>
     <w:p>
@@ -10376,7 +10520,7 @@
         <w:sz w:val="20"/>
         <w:szCs w:val="20"/>
       </w:rPr>
-      <w:t>&lt;</w:t>
+      <w:t/>
     </w:r>
     <w:r>
       <w:rPr>
@@ -10386,7 +10530,7 @@
         <w:sz w:val="16"/>
         <w:szCs w:val="16"/>
       </w:rPr>
-      <w:t xml:space="preserve">Colocar los apellidos e inicial del primer nombre de los autores en orden alfabético, </w:t>
+      <w:t xml:space="preserve">Apellidos e inicial de los autores (por completar)</w:t>
     </w:r>
   </w:p>
   <w:p>
@@ -10401,7 +10545,7 @@
         <w:sz w:val="16"/>
         <w:szCs w:val="16"/>
       </w:rPr>
-      <w:t>separados por punto y coma</w:t>
+      <w:t/>
     </w:r>
     <w:r>
       <w:rPr>
@@ -10409,7 +10553,7 @@
         <w:sz w:val="18"/>
         <w:szCs w:val="18"/>
       </w:rPr>
-      <w:t>&gt;</w:t>
+      <w:t/>
     </w:r>
     <w:r>
       <w:rPr>
@@ -10612,17 +10756,17 @@
     </w:r>
     <w:r>
       <w:tab/>
-      <w:t xml:space="preserve"> &lt;</w:t>
+      <w:t xml:space="preserve"/>
     </w:r>
     <w:r>
       <w:rPr>
         <w:i/>
         <w:iCs/>
       </w:rPr>
-      <w:t>Título de Proyecto</w:t>
+      <w:t>Veterinaria Mr. Pet</w:t>
     </w:r>
     <w:r>
-      <w:t>&gt;</w:t>
+      <w:t/>
     </w:r>
   </w:p>
   <w:p>

</xml_diff>

<commit_message>
Agrega integrantes al informe de proyecto
</commit_message>
<xml_diff>
--- a/informe/INFORME_PROYECTO_FINAL.docx
+++ b/informe/INFORME_PROYECTO_FINAL.docx
@@ -489,18 +489,11 @@
       <w:r>
         <w:rPr>
           <w:rFonts w:ascii="Arial" w:eastAsia="Arial" w:hAnsi="Arial" w:cs="Arial"/>
-          <w:color w:val="BFBFBF" w:themeColor="background1" w:themeShade="BF"/>
+          <w:i w:val="0"/>
+          <w:color w:val="000000"/>
           <w:lang w:val="es-PE"/>
         </w:rPr>
-        <w:t>APELLIDOS, Nombres en orden alfabético</w:t>
-      </w:r>
-      <w:r>
-        <w:rPr>
-          <w:rFonts w:ascii="Arial" w:eastAsia="Arial" w:hAnsi="Arial" w:cs="Arial"/>
-          <w:color w:val="BFBFBF" w:themeColor="background1" w:themeShade="BF"/>
-          <w:lang w:val="es-PE"/>
-        </w:rPr>
-        <w:t xml:space="preserve"> (% participación)</w:t>
+        <w:t>CALDERÓN SEVILLANO, Cesar Eduardo (% participación)</w:t>
       </w:r>
     </w:p>
     <w:p>
@@ -521,10 +514,11 @@
       <w:r>
         <w:rPr>
           <w:rFonts w:ascii="Arial" w:eastAsia="Arial" w:hAnsi="Arial" w:cs="Arial"/>
-          <w:color w:val="BFBFBF" w:themeColor="background1" w:themeShade="BF"/>
+          <w:i w:val="0"/>
+          <w:color w:val="000000"/>
           <w:lang w:val="es-PE"/>
         </w:rPr>
-        <w:t>APELLIDOS, Nombres en orden alfabético (% participación)</w:t>
+        <w:t>CARRANZA CASIQUE, Segundo Abel (% participación)</w:t>
       </w:r>
     </w:p>
     <w:p>
@@ -545,10 +539,11 @@
       <w:r>
         <w:rPr>
           <w:rFonts w:ascii="Arial" w:eastAsia="Arial" w:hAnsi="Arial" w:cs="Arial"/>
-          <w:color w:val="BFBFBF" w:themeColor="background1" w:themeShade="BF"/>
+          <w:i w:val="0"/>
+          <w:color w:val="000000"/>
           <w:lang w:val="es-PE"/>
         </w:rPr>
-        <w:t>APELLIDOS, Nombres en orden alfabético (% participación)</w:t>
+        <w:t>GALAS ZAVALETA, Emmanuel Alfredo (% participación)</w:t>
       </w:r>
     </w:p>
     <w:p>
@@ -569,10 +564,11 @@
       <w:r>
         <w:rPr>
           <w:rFonts w:ascii="Arial" w:eastAsia="Arial" w:hAnsi="Arial" w:cs="Arial"/>
-          <w:color w:val="BFBFBF" w:themeColor="background1" w:themeShade="BF"/>
+          <w:i w:val="0"/>
+          <w:color w:val="000000"/>
           <w:lang w:val="es-PE"/>
         </w:rPr>
-        <w:t>APELLIDOS, Nombres en orden alfabético (% participación)</w:t>
+        <w:t>GARCÍA LEIVA, Cristhian Julio (% participación)</w:t>
       </w:r>
     </w:p>
     <w:p>
@@ -593,10 +589,36 @@
       <w:r>
         <w:rPr>
           <w:rFonts w:ascii="Arial" w:eastAsia="Arial" w:hAnsi="Arial" w:cs="Arial"/>
+          <w:i w:val="0"/>
+          <w:color w:val="000000"/>
+          <w:lang w:val="es-PE"/>
+        </w:rPr>
+        <w:t>JULCA MORI, Giancarlo Renato (% participación)</w:t>
+      </w:r>
+    </w:p>
+    <w:p>
+      <w:pPr>
+        <w:pStyle w:val="Prrafodelista"/>
+        <w:numPr>
+          <w:ilvl w:val="0"/>
+          <w:numId w:val="40"/>
+        </w:numPr>
+        <w:spacing w:before="59" w:line="360" w:lineRule="auto"/>
+        <w:ind w:right="118"/>
+        <w:rPr>
+          <w:rFonts w:ascii="Arial" w:eastAsia="Arial" w:hAnsi="Arial" w:cs="Arial"/>
           <w:color w:val="BFBFBF" w:themeColor="background1" w:themeShade="BF"/>
           <w:lang w:val="es-PE"/>
         </w:rPr>
-        <w:t>APELLIDOS, Nombres en orden alfabético (% participación)</w:t>
+      </w:pPr>
+      <w:r>
+        <w:rPr>
+          <w:rFonts w:ascii="Arial" w:eastAsia="Arial" w:hAnsi="Arial" w:cs="Arial"/>
+          <w:i w:val="0"/>
+          <w:color w:val="000000"/>
+          <w:lang w:val="es-PE"/>
+        </w:rPr>
+        <w:t>MINAYA ESPINOZA, Erick David (% participación)</w:t>
       </w:r>
     </w:p>
     <w:p>
@@ -4606,7 +4628,7 @@
               </w:rPr>
             </w:pPr>
             <w:r>
-              <w:t>Por completar</w:t>
+              <w:t>Calderón Sevillano, Cesar Eduardo (n00582070); Carranza Casique, Segundo Abel (n00567615); Galas Zavaleta, Emmanuel Alfredo (n00583759); García Leiva, Cristhian Julio (n00566002); Julca Mori, Giancarlo Renato (n00581930); Minaya Espinoza, Erick David (n00459115)</w:t>
             </w:r>
           </w:p>
         </w:tc>
@@ -10530,7 +10552,7 @@
         <w:sz w:val="16"/>
         <w:szCs w:val="16"/>
       </w:rPr>
-      <w:t xml:space="preserve">Apellidos e inicial de los autores (por completar)</w:t>
+      <w:t xml:space="preserve">Calderón, C.; Carranza, S.; Galas, E.; García, C.; Julca, G.; Minaya, E.</w:t>
     </w:r>
   </w:p>
   <w:p>

</xml_diff>

<commit_message>
Agrega al propietario de Mr. Pet como cliente y patrocinador
</commit_message>
<xml_diff>
--- a/informe/INFORME_PROYECTO_FINAL.docx
+++ b/informe/INFORME_PROYECTO_FINAL.docx
@@ -4484,7 +4484,7 @@
               </w:rPr>
             </w:pPr>
             <w:r>
-              <w:t>Veterinaria Mr. Pet</w:t>
+              <w:t>Veterinaria Mr. Pet (propietario: Saul Perez Sanchez)</w:t>
             </w:r>
           </w:p>
         </w:tc>
@@ -4532,7 +4532,7 @@
               </w:rPr>
             </w:pPr>
             <w:r>
-              <w:t>Propietario(a) de la veterinaria Mr. Pet (por confirmar)</w:t>
+              <w:t>Saul Perez Sanchez (propietario de la veterinaria Mr. Pet)</w:t>
             </w:r>
           </w:p>
         </w:tc>

</xml_diff>